<commit_message>
Renato Russo: revisão da Parte 2 (números do Mané Garrincha, saída do Negrete, ganchos variados)
Co-Authored-By: Claude Opus 5.5 <noreply@anthropic.com>
Claude-Session: https://claude.ai/code/session_01MJjUEEZrxQDEUifKK2vj9g
</commit_message>
<xml_diff>
--- a/roteiros/renato-russo/Renato_Parte2.docx
+++ b/roteiros/renato-russo/Renato_Parte2.docx
@@ -111,7 +111,7 @@
         <w:rPr>
           <w:color w:val="C00000"/>
         </w:rPr>
-        <w:t>Mas foi justamente nessa fase, sem banda e sem dinheiro, que Renato tomou uma decisão que, até hoje, mexe com muito dinheiro. Ele inventou um nome. E esse nome, quase quarenta anos depois, ia parar no Superior Tribunal de Justiça.</w:t>
+        <w:t>Mas foi justamente nessa fase, sozinho e sem banda, que Renato tomou uma decisão que, até hoje, mexe com muito dinheiro. Ele inventou um nome. E esse nome, quase quarenta anos depois, ia parar no Superior Tribunal de Justiça.</w:t>
       </w:r>
     </w:p>
     <w:p>
@@ -143,7 +143,7 @@
         <w:rPr>
           <w:color w:val="000000"/>
         </w:rPr>
-        <w:t>No ano seguinte, entrou o guitarrista. Um garoto de dezoito anos, filho de diplomata, sobrinho-neto do maestro Heitor Villa-Lobos. O nome dele era Dado Villa-Lobos.</w:t>
+        <w:t>No ano seguinte, entrou o guitarrista. Um garoto, filho de diplomata, sobrinho-neto do maestro Heitor Villa-Lobos. O nome dele era Dado Villa-Lobos.</w:t>
       </w:r>
     </w:p>
     <w:p>
@@ -159,7 +159,7 @@
         <w:rPr>
           <w:color w:val="C00000"/>
         </w:rPr>
-        <w:t>Grave bem esses dois nomes, Dado e Bonfá. Durante anos, eles dividiram o palco com Renato como irmãos. Décadas depois da morte dele, os dois iam enfrentar o único filho de Renato numa batalha na Justiça. E o motivo da briga era aquele nome que Renato tinha inventado.</w:t>
+        <w:t>Agora preste atenção nesses dois, Dado e Bonfá. Durante anos, eles dividiram o palco com Renato como irmãos. Décadas depois da morte dele, os dois iam enfrentar o único filho de Renato numa batalha na Justiça. E o motivo da briga era aquele nome que Renato tinha inventado.</w:t>
       </w:r>
     </w:p>
     <w:p>
@@ -327,7 +327,7 @@
         <w:rPr>
           <w:color w:val="000000"/>
         </w:rPr>
-        <w:t>O show atrasou quase uma hora. Na espera, o clima foi esquentando. Gente espremida na grade, num calor que só aumentava.</w:t>
+        <w:t>O show começou com uma hora de atraso. Na espera, o público foi ficando impaciente.</w:t>
       </w:r>
     </w:p>
     <w:p>
@@ -343,7 +343,7 @@
         <w:rPr>
           <w:color w:val="000000"/>
         </w:rPr>
-        <w:t>Na quarta música, Conexão Amazônica, um homem conseguiu subir no palco e partiu para cima de Renato. Ele chegou a agarrar o cantor.</w:t>
+        <w:t>Logo nas primeiras músicas, um homem conseguiu chegar até Renato e partiu para cima dele.</w:t>
       </w:r>
     </w:p>
     <w:p>
@@ -351,7 +351,7 @@
         <w:rPr>
           <w:color w:val="000000"/>
         </w:rPr>
-        <w:t>O homem foi retirado. Mas a noite já tinha saído do controle.</w:t>
+        <w:t>Os seguranças tiraram o homem. Mas a noite já tinha saído do controle.</w:t>
       </w:r>
     </w:p>
     <w:p>
@@ -359,7 +359,15 @@
         <w:rPr>
           <w:color w:val="000000"/>
         </w:rPr>
-        <w:t>Objetos começaram a voar em direção ao palco. Renato tentou continuar. A banda tocou mais algumas músicas e deixou o palco antes da hora.</w:t>
+        <w:t>Objetos começaram a voar em direção ao palco. Renato respondeu à plateia com provocações. E a raiva só cresceu.</w:t>
+      </w:r>
+    </w:p>
+    <w:p>
+      <w:r>
+        <w:rPr>
+          <w:color w:val="000000"/>
+        </w:rPr>
+        <w:t>A banda tocou oito músicas. O show durou cinquenta e oito minutos. Depois, a Legião deixou o palco e não voltou.</w:t>
       </w:r>
     </w:p>
     <w:p>
@@ -375,7 +383,7 @@
         <w:rPr>
           <w:color w:val="000000"/>
         </w:rPr>
-        <w:t>No fim da noite, mais de trezentas pessoas tinham ficado feridas. Catorze ônibus foram apedrejados.</w:t>
+        <w:t>Segundo o levantamento publicado pela imprensa de Brasília, cerca de quatrocentas pessoas ficaram feridas. Setenta foram detidas. Sessenta e quatro ônibus foram depredados.</w:t>
       </w:r>
     </w:p>
     <w:p>
@@ -447,7 +455,7 @@
         <w:rPr>
           <w:color w:val="000000"/>
         </w:rPr>
-        <w:t>Guarde esse nome também. Giuliano.</w:t>
+        <w:t>Esse menino é a peça central de tudo o que vem depois.</w:t>
       </w:r>
     </w:p>
     <w:p>
@@ -479,7 +487,7 @@
         <w:rPr>
           <w:color w:val="000000"/>
         </w:rPr>
-        <w:t>Guarde também o nome desse disco. As Quatro Estações.</w:t>
+        <w:t>E o nome desse disco vai voltar nesta história. Mais de trinta anos depois, uma homenagem a Renato ia usar um nome parecido com esse. E essa homenagem ia acabar proibida.</w:t>
       </w:r>
     </w:p>
     <w:p>
@@ -487,15 +495,7 @@
         <w:rPr>
           <w:color w:val="000000"/>
         </w:rPr>
-        <w:t>Mais de trinta anos depois, uma homenagem a Renato ia usar um nome parecido com esse. E essa homenagem ia acabar proibida.</w:t>
-      </w:r>
-    </w:p>
-    <w:p>
-      <w:r>
-        <w:rPr>
-          <w:color w:val="000000"/>
-        </w:rPr>
-        <w:t>Durante a produção do disco, o baixista Negrete saiu da banda. A Legião voltou a ser um trio.</w:t>
+        <w:t>Pouco antes da gravação desse disco, o baixista Negrete foi afastado da banda. A Legião voltou a ser um trio.</w:t>
       </w:r>
     </w:p>
     <w:p>

</xml_diff>